<commit_message>
Fix CI no-tests failure with failIfNoTests=false
</commit_message>
<xml_diff>
--- a/test-reports/CI_ERROR_LOG_EN.docx
+++ b/test-reports/CI_ERROR_LOG_EN.docx
@@ -2,7 +2,7 @@
 <file path=word/document.xml><?xml version="1.0" encoding="utf-8"?>
 <w:document xmlns:w="http://schemas.openxmlformats.org/wordprocessingml/2006/main" xmlns:m="http://schemas.openxmlformats.org/officeDocument/2006/math" xmlns:r="http://schemas.openxmlformats.org/officeDocument/2006/relationships" xmlns:o="urn:schemas-microsoft-com:office:office" xmlns:v="urn:schemas-microsoft-com:vml" xmlns:w10="urn:schemas-microsoft-com:office:word" xmlns:a="http://schemas.openxmlformats.org/drawingml/2006/main" xmlns:pic="http://schemas.openxmlformats.org/drawingml/2006/picture" xmlns:wp="http://schemas.openxmlformats.org/drawingml/2006/wordprocessingDrawing">
   <w:body>
-    <w:bookmarkStart w:id="22" w:name="ci-assignment-error-log-english"/>
+    <w:bookmarkStart w:id="24" w:name="ci-assignment-error-log-english"/>
     <w:p>
       <w:pPr>
         <w:pStyle w:val="Heading1"/>
@@ -71,7 +71,7 @@
       </w:r>
     </w:p>
     <w:bookmarkEnd w:id="9"/>
-    <w:bookmarkStart w:id="19" w:name="error-timeline-chronological"/>
+    <w:bookmarkStart w:id="21" w:name="error-timeline-chronological"/>
     <w:p>
       <w:pPr>
         <w:pStyle w:val="Heading2"/>
@@ -1703,6 +1703,367 @@
       </w:r>
       <w:r>
         <w:t xml:space="preserve">: created and ready to run after push.</w:t>
+      </w:r>
+    </w:p>
+    <w:bookmarkEnd w:id="18"/>
+    <w:bookmarkStart w:id="19" w:name="X98756f3f5d60e1d3ffe56ee40dd68286bb24d93"/>
+    <w:p>
+      <w:pPr>
+        <w:pStyle w:val="Heading3"/>
+      </w:pPr>
+      <w:r>
+        <w:t xml:space="preserve">Step 10: First GitHub Actions web run failed (dependency resolution)</w:t>
+      </w:r>
+    </w:p>
+    <w:p>
+      <w:pPr>
+        <w:pStyle w:val="Compact"/>
+        <w:numPr>
+          <w:ilvl w:val="0"/>
+          <w:numId w:val="1016"/>
+        </w:numPr>
+      </w:pPr>
+      <w:r>
+        <w:rPr>
+          <w:b/>
+          <w:bCs/>
+        </w:rPr>
+        <w:t xml:space="preserve">Symptom</w:t>
+      </w:r>
+      <w:r>
+        <w:t xml:space="preserve">: CI log shows</w:t>
+      </w:r>
+      <w:r>
+        <w:t xml:space="preserve"> </w:t>
+      </w:r>
+      <w:r>
+        <w:rPr>
+          <w:rStyle w:val="VerbatimChar"/>
+        </w:rPr>
+        <w:t xml:space="preserve">Could not resolve dependencies ... com.shopizer:sm-core-model ... from/to spring-releases ... Not authorized</w:t>
+      </w:r>
+    </w:p>
+    <w:p>
+      <w:pPr>
+        <w:pStyle w:val="Compact"/>
+        <w:numPr>
+          <w:ilvl w:val="0"/>
+          <w:numId w:val="1016"/>
+        </w:numPr>
+      </w:pPr>
+      <w:r>
+        <w:rPr>
+          <w:b/>
+          <w:bCs/>
+        </w:rPr>
+        <w:t xml:space="preserve">Root cause</w:t>
+      </w:r>
+      <w:r>
+        <w:t xml:space="preserve">: workflow built only</w:t>
+      </w:r>
+      <w:r>
+        <w:t xml:space="preserve"> </w:t>
+      </w:r>
+      <w:r>
+        <w:rPr>
+          <w:rStyle w:val="VerbatimChar"/>
+        </w:rPr>
+        <w:t xml:space="preserve">sm-core</w:t>
+      </w:r>
+      <w:r>
+        <w:t xml:space="preserve"> </w:t>
+      </w:r>
+      <w:r>
+        <w:t xml:space="preserve">and did not build required local dependency modules in the same reactor; Maven then tried remote resolution for</w:t>
+      </w:r>
+      <w:r>
+        <w:t xml:space="preserve"> </w:t>
+      </w:r>
+      <w:r>
+        <w:rPr>
+          <w:rStyle w:val="VerbatimChar"/>
+        </w:rPr>
+        <w:t xml:space="preserve">sm-core-model</w:t>
+      </w:r>
+      <w:r>
+        <w:t xml:space="preserve"> </w:t>
+      </w:r>
+      <w:r>
+        <w:t xml:space="preserve">and hit authorization failure.</w:t>
+      </w:r>
+    </w:p>
+    <w:p>
+      <w:pPr>
+        <w:pStyle w:val="Compact"/>
+        <w:numPr>
+          <w:ilvl w:val="0"/>
+          <w:numId w:val="1016"/>
+        </w:numPr>
+      </w:pPr>
+      <w:r>
+        <w:rPr>
+          <w:b/>
+          <w:bCs/>
+        </w:rPr>
+        <w:t xml:space="preserve">Fix</w:t>
+      </w:r>
+      <w:r>
+        <w:t xml:space="preserve">: update command to</w:t>
+      </w:r>
+      <w:r>
+        <w:t xml:space="preserve"> </w:t>
+      </w:r>
+      <w:r>
+        <w:rPr>
+          <w:rStyle w:val="VerbatimChar"/>
+        </w:rPr>
+        <w:t xml:space="preserve">./mvnw -B -pl sm-core -am -Dtest=DataUtilsTest test</w:t>
+      </w:r>
+      <w:r>
+        <w:t xml:space="preserve"> </w:t>
+      </w:r>
+      <w:r>
+        <w:t xml:space="preserve">so Maven also builds required modules (</w:t>
+      </w:r>
+      <w:r>
+        <w:rPr>
+          <w:rStyle w:val="VerbatimChar"/>
+        </w:rPr>
+        <w:t xml:space="preserve">-am</w:t>
+      </w:r>
+      <w:r>
+        <w:t xml:space="preserve">).</w:t>
+      </w:r>
+    </w:p>
+    <w:p>
+      <w:pPr>
+        <w:pStyle w:val="Compact"/>
+        <w:numPr>
+          <w:ilvl w:val="0"/>
+          <w:numId w:val="1016"/>
+        </w:numPr>
+      </w:pPr>
+      <w:r>
+        <w:rPr>
+          <w:b/>
+          <w:bCs/>
+        </w:rPr>
+        <w:t xml:space="preserve">Submission note</w:t>
+      </w:r>
+      <w:r>
+        <w:t xml:space="preserve">: commit this fix and re-run Actions, then capture screenshots for both “failed run” and “fixed successful run”.</w:t>
+      </w:r>
+    </w:p>
+    <w:bookmarkEnd w:id="19"/>
+    <w:bookmarkStart w:id="20" w:name="X5d0383c50068df0843927efb7e7646e3479c26e"/>
+    <w:p>
+      <w:pPr>
+        <w:pStyle w:val="Heading3"/>
+      </w:pPr>
+      <w:r>
+        <w:t xml:space="preserve">Step 11: Second GitHub Actions failure (No tests were executed)</w:t>
+      </w:r>
+    </w:p>
+    <w:p>
+      <w:pPr>
+        <w:pStyle w:val="Compact"/>
+        <w:numPr>
+          <w:ilvl w:val="0"/>
+          <w:numId w:val="1017"/>
+        </w:numPr>
+      </w:pPr>
+      <w:r>
+        <w:rPr>
+          <w:b/>
+          <w:bCs/>
+        </w:rPr>
+        <w:t xml:space="preserve">Symptom</w:t>
+      </w:r>
+      <w:r>
+        <w:t xml:space="preserve">: CI failed with</w:t>
+      </w:r>
+      <w:r>
+        <w:t xml:space="preserve"> </w:t>
+      </w:r>
+      <w:r>
+        <w:rPr>
+          <w:rStyle w:val="VerbatimChar"/>
+        </w:rPr>
+        <w:t xml:space="preserve">Failed to execute goal ... maven-surefire-plugin ... on project sm-core-model: No tests were executed!</w:t>
+      </w:r>
+    </w:p>
+    <w:p>
+      <w:pPr>
+        <w:pStyle w:val="Compact"/>
+        <w:numPr>
+          <w:ilvl w:val="0"/>
+          <w:numId w:val="1017"/>
+        </w:numPr>
+      </w:pPr>
+      <w:r>
+        <w:rPr>
+          <w:b/>
+          <w:bCs/>
+        </w:rPr>
+        <w:t xml:space="preserve">Root cause</w:t>
+      </w:r>
+      <w:r>
+        <w:t xml:space="preserve">: after adding</w:t>
+      </w:r>
+      <w:r>
+        <w:t xml:space="preserve"> </w:t>
+      </w:r>
+      <w:r>
+        <w:rPr>
+          <w:rStyle w:val="VerbatimChar"/>
+        </w:rPr>
+        <w:t xml:space="preserve">-am</w:t>
+      </w:r>
+      <w:r>
+        <w:t xml:space="preserve">, Maven enters dependency modules such as</w:t>
+      </w:r>
+      <w:r>
+        <w:t xml:space="preserve"> </w:t>
+      </w:r>
+      <w:r>
+        <w:rPr>
+          <w:rStyle w:val="VerbatimChar"/>
+        </w:rPr>
+        <w:t xml:space="preserve">sm-core-model</w:t>
+      </w:r>
+      <w:r>
+        <w:t xml:space="preserve">; with</w:t>
+      </w:r>
+      <w:r>
+        <w:t xml:space="preserve"> </w:t>
+      </w:r>
+      <w:r>
+        <w:rPr>
+          <w:rStyle w:val="VerbatimChar"/>
+        </w:rPr>
+        <w:t xml:space="preserve">-Dtest=DataUtilsTest</w:t>
+      </w:r>
+      <w:r>
+        <w:t xml:space="preserve">, only</w:t>
+      </w:r>
+      <w:r>
+        <w:t xml:space="preserve"> </w:t>
+      </w:r>
+      <w:r>
+        <w:rPr>
+          <w:rStyle w:val="VerbatimChar"/>
+        </w:rPr>
+        <w:t xml:space="preserve">sm-core</w:t>
+      </w:r>
+      <w:r>
+        <w:t xml:space="preserve"> </w:t>
+      </w:r>
+      <w:r>
+        <w:t xml:space="preserve">has matching tests, while other modules have no matching tests and surefire fails by default.</w:t>
+      </w:r>
+    </w:p>
+    <w:p>
+      <w:pPr>
+        <w:pStyle w:val="Compact"/>
+        <w:numPr>
+          <w:ilvl w:val="0"/>
+          <w:numId w:val="1017"/>
+        </w:numPr>
+      </w:pPr>
+      <w:r>
+        <w:rPr>
+          <w:b/>
+          <w:bCs/>
+        </w:rPr>
+        <w:t xml:space="preserve">Fix</w:t>
+      </w:r>
+      <w:r>
+        <w:t xml:space="preserve">: update command to</w:t>
+      </w:r>
+      <w:r>
+        <w:t xml:space="preserve"> </w:t>
+      </w:r>
+      <w:r>
+        <w:rPr>
+          <w:rStyle w:val="VerbatimChar"/>
+        </w:rPr>
+        <w:t xml:space="preserve">./mvnw -B -pl sm-core -am -Dtest=DataUtilsTest -DfailIfNoTests=false test</w:t>
+      </w:r>
+      <w:r>
+        <w:t xml:space="preserve">.</w:t>
+      </w:r>
+    </w:p>
+    <w:p>
+      <w:pPr>
+        <w:pStyle w:val="Compact"/>
+        <w:numPr>
+          <w:ilvl w:val="0"/>
+          <w:numId w:val="1017"/>
+        </w:numPr>
+      </w:pPr>
+      <w:r>
+        <w:rPr>
+          <w:b/>
+          <w:bCs/>
+        </w:rPr>
+        <w:t xml:space="preserve">Local validation</w:t>
+      </w:r>
+      <w:r>
+        <w:t xml:space="preserve">: Reactor Summary shows</w:t>
+      </w:r>
+      <w:r>
+        <w:t xml:space="preserve"> </w:t>
+      </w:r>
+      <w:r>
+        <w:rPr>
+          <w:rStyle w:val="VerbatimChar"/>
+        </w:rPr>
+        <w:t xml:space="preserve">shopizer / sm-core-model / sm-core-modules / sm-core</w:t>
+      </w:r>
+      <w:r>
+        <w:t xml:space="preserve"> </w:t>
+      </w:r>
+      <w:r>
+        <w:t xml:space="preserve">all</w:t>
+      </w:r>
+      <w:r>
+        <w:t xml:space="preserve"> </w:t>
+      </w:r>
+      <w:r>
+        <w:rPr>
+          <w:rStyle w:val="VerbatimChar"/>
+        </w:rPr>
+        <w:t xml:space="preserve">SUCCESS</w:t>
+      </w:r>
+      <w:r>
+        <w:t xml:space="preserve">, and</w:t>
+      </w:r>
+      <w:r>
+        <w:t xml:space="preserve"> </w:t>
+      </w:r>
+      <w:r>
+        <w:rPr>
+          <w:rStyle w:val="VerbatimChar"/>
+        </w:rPr>
+        <w:t xml:space="preserve">DataUtilsTest</w:t>
+      </w:r>
+      <w:r>
+        <w:t xml:space="preserve"> </w:t>
+      </w:r>
+      <w:r>
+        <w:t xml:space="preserve">reports</w:t>
+      </w:r>
+      <w:r>
+        <w:t xml:space="preserve"> </w:t>
+      </w:r>
+      <w:r>
+        <w:rPr>
+          <w:rStyle w:val="VerbatimChar"/>
+        </w:rPr>
+        <w:t xml:space="preserve">Tests run: 9, Failures: 0, Errors: 0, Skipped: 0</w:t>
+      </w:r>
+      <w:r>
+        <w:t xml:space="preserve">.</w:t>
       </w:r>
     </w:p>
     <w:p>
@@ -1712,9 +2073,9 @@
         </w:pict>
       </w:r>
     </w:p>
-    <w:bookmarkEnd w:id="18"/>
-    <w:bookmarkEnd w:id="19"/>
-    <w:bookmarkStart w:id="20" w:name="X5f81be2ce4eec768e73266ba10d98afd9964497"/>
+    <w:bookmarkEnd w:id="20"/>
+    <w:bookmarkEnd w:id="21"/>
+    <w:bookmarkStart w:id="22" w:name="X5f81be2ce4eec768e73266ba10d98afd9964497"/>
     <w:p>
       <w:pPr>
         <w:pStyle w:val="Heading2"/>
@@ -1728,7 +2089,7 @@
         <w:pStyle w:val="Compact"/>
         <w:numPr>
           <w:ilvl w:val="0"/>
-          <w:numId w:val="1016"/>
+          <w:numId w:val="1018"/>
         </w:numPr>
       </w:pPr>
       <w:r>
@@ -1747,7 +2108,7 @@
         <w:pStyle w:val="Compact"/>
         <w:numPr>
           <w:ilvl w:val="0"/>
-          <w:numId w:val="1016"/>
+          <w:numId w:val="1018"/>
         </w:numPr>
       </w:pPr>
       <w:r>
@@ -1766,7 +2127,7 @@
         <w:pStyle w:val="Compact"/>
         <w:numPr>
           <w:ilvl w:val="0"/>
-          <w:numId w:val="1016"/>
+          <w:numId w:val="1018"/>
         </w:numPr>
       </w:pPr>
       <w:r>
@@ -1785,7 +2146,7 @@
         <w:pStyle w:val="Compact"/>
         <w:numPr>
           <w:ilvl w:val="0"/>
-          <w:numId w:val="1016"/>
+          <w:numId w:val="1018"/>
         </w:numPr>
       </w:pPr>
       <w:r>
@@ -1804,7 +2165,7 @@
         <w:pStyle w:val="Compact"/>
         <w:numPr>
           <w:ilvl w:val="0"/>
-          <w:numId w:val="1016"/>
+          <w:numId w:val="1018"/>
         </w:numPr>
       </w:pPr>
       <w:r>
@@ -1818,8 +2179,8 @@
         <w:t xml:space="preserve">: resolved / unresolved (with next plan)</w:t>
       </w:r>
     </w:p>
-    <w:bookmarkEnd w:id="20"/>
-    <w:bookmarkStart w:id="21" w:name="to-be-added-in-next-runs"/>
+    <w:bookmarkEnd w:id="22"/>
+    <w:bookmarkStart w:id="23" w:name="to-be-added-in-next-runs"/>
     <w:p>
       <w:pPr>
         <w:pStyle w:val="Heading2"/>
@@ -1833,7 +2194,7 @@
         <w:pStyle w:val="Compact"/>
         <w:numPr>
           <w:ilvl w:val="0"/>
-          <w:numId w:val="1017"/>
+          <w:numId w:val="1019"/>
         </w:numPr>
       </w:pPr>
       <w:r>
@@ -1845,7 +2206,7 @@
         <w:pStyle w:val="Compact"/>
         <w:numPr>
           <w:ilvl w:val="0"/>
-          <w:numId w:val="1017"/>
+          <w:numId w:val="1019"/>
         </w:numPr>
       </w:pPr>
       <w:r>
@@ -1887,15 +2248,15 @@
         <w:pStyle w:val="Compact"/>
         <w:numPr>
           <w:ilvl w:val="0"/>
-          <w:numId w:val="1017"/>
+          <w:numId w:val="1019"/>
         </w:numPr>
       </w:pPr>
       <w:r>
         <w:t xml:space="preserve">Re-run screenshots after fixes showing successful pipeline</w:t>
       </w:r>
     </w:p>
-    <w:bookmarkEnd w:id="21"/>
-    <w:bookmarkEnd w:id="22"/>
+    <w:bookmarkEnd w:id="23"/>
+    <w:bookmarkEnd w:id="24"/>
     <w:sectPr>
       <w:footnotePr>
         <w:numRestart w:val="eachSect"/>
@@ -2161,6 +2522,12 @@
     <w:abstractNumId w:val="991"/>
   </w:num>
   <w:num w:numId="1017">
+    <w:abstractNumId w:val="991"/>
+  </w:num>
+  <w:num w:numId="1018">
+    <w:abstractNumId w:val="991"/>
+  </w:num>
+  <w:num w:numId="1019">
     <w:abstractNumId w:val="991"/>
   </w:num>
 </w:numbering>

</xml_diff>